<commit_message>
Tự động áp migration khi khởi động (deploy không cần chạy tay)
- Program.cs: MigrateAsync cho cả TenantStoreDbContext và AppDbContext trước khi seed,
  có log + ném lại nếu lỗi để hiện rõ khi khởi động
- Khắc phục việc deploy lên server không tạo/không cập nhật schema (cột/bảng mới thiếu)
- Đã kiểm chứng: app tự áp toàn bộ 14 migration vào một database rỗng, tạo đủ bảng

Co-Authored-By: Claude Opus 4.8 <noreply@anthropic.com>
</commit_message>
<xml_diff>
--- a/Docs/Huong-dan-su-dung-Kho-San-xuat-Ban-hang.docx
+++ b/Docs/Huong-dan-su-dung-Kho-San-xuat-Ban-hang.docx
@@ -2405,6 +2405,62 @@
           </w:p>
         </w:tc>
       </w:tr>
+      <w:tr>
+        <w:tc>
+          <w:tcPr>
+            <w:tcW w:type="dxa" w:w="3200"/>
+            <w:shd w:fill="FFFFFF" w:color="auto" w:val="clear"/>
+            <w:tcMar>
+              <w:top w:type="dxa" w:w="60"/>
+              <w:left w:type="dxa" w:w="100"/>
+              <w:bottom w:type="dxa" w:w="60"/>
+              <w:right w:type="dxa" w:w="100"/>
+            </w:tcMar>
+          </w:tcPr>
+          <w:p>
+            <w:pPr>
+              <w:jc w:val="left"/>
+            </w:pPr>
+            <w:r>
+              <w:rPr>
+                <w:b/>
+                <w:bCs/>
+                <w:color w:val="444444"/>
+                <w:sz w:val="20"/>
+                <w:szCs w:val="20"/>
+              </w:rPr>
+              <w:t xml:space="preserve">Hao hụt % (tùy chọn)</w:t>
+            </w:r>
+          </w:p>
+        </w:tc>
+        <w:tc>
+          <w:tcPr>
+            <w:tcW w:type="dxa" w:w="6100"/>
+            <w:shd w:fill="FFFFFF" w:color="auto" w:val="clear"/>
+            <w:tcMar>
+              <w:top w:type="dxa" w:w="60"/>
+              <w:left w:type="dxa" w:w="100"/>
+              <w:bottom w:type="dxa" w:w="60"/>
+              <w:right w:type="dxa" w:w="100"/>
+            </w:tcMar>
+          </w:tcPr>
+          <w:p>
+            <w:pPr>
+              <w:jc w:val="left"/>
+            </w:pPr>
+            <w:r>
+              <w:rPr>
+                <w:b w:val="false"/>
+                <w:bCs w:val="false"/>
+                <w:color w:val="444444"/>
+                <w:sz w:val="20"/>
+                <w:szCs w:val="20"/>
+              </w:rPr>
+              <w:t xml:space="preserve">0  (đặt vd 10 để cộng thêm 10% bù hao hụt khi trừ kho)</w:t>
+            </w:r>
+          </w:p>
+        </w:tc>
+      </w:tr>
     </w:tbl>
     <w:p>
       <w:pPr>
@@ -2429,7 +2485,7 @@
           <w:sz w:val="22"/>
           <w:szCs w:val="22"/>
         </w:rPr>
-        <w:t xml:space="preserve">Lệnh sản xuất sẽ dựa vào định mức này để tự tính và trừ nguyên liệu. Vd làm 30 bánh → cần 30 × 0.1 = 3 kg bột.</w:t>
+        <w:t xml:space="preserve">Lệnh sản xuất tự tính và trừ nguyên liệu theo công thức: định lượng × số lượng SX × (1 + hao hụt%). Vd làm 30 bánh, định lượng 0.1: hao hụt 0% → cần 3 kg; hao hụt 10% → cần 30 × 0.1 × 1.1 = 3.3 kg. Hao hụt % giúp định mức sát thực tế hơn; phần lệch còn lại được xử lý bằng Kiểm kê (mục 9).</w:t>
       </w:r>
     </w:p>
     <w:p>
@@ -4103,7 +4159,256 @@
           <w:sz w:val="30"/>
           <w:szCs w:val="30"/>
         </w:rPr>
-        <w:t xml:space="preserve">9. Kết quả kiểm chứng của luồng mẫu</w:t>
+        <w:t xml:space="preserve">9. Kiểm kê &amp; điều chỉnh tồn (định kỳ)</w:t>
+      </w:r>
+    </w:p>
+    <w:p>
+      <w:pPr>
+        <w:spacing w:after="100" w:line="276"/>
+      </w:pPr>
+      <w:r>
+        <w:rPr>
+          <w:sz w:val="22"/>
+          <w:szCs w:val="22"/>
+        </w:rPr>
+        <w:t xml:space="preserve">Do trừ kho theo định mức là con số lý thuyết, tồn sổ sẽ lệch dần tồn thực (bột rơi vãi, mẻ hỏng, cân xê xích...). </w:t>
+      </w:r>
+      <w:r>
+        <w:rPr>
+          <w:b/>
+          <w:bCs/>
+          <w:sz w:val="22"/>
+          <w:szCs w:val="22"/>
+        </w:rPr>
+        <w:t xml:space="preserve">Kiểm kê định kỳ để kéo sổ về đúng thực tế.</w:t>
+      </w:r>
+    </w:p>
+    <w:p>
+      <w:pPr>
+        <w:spacing w:after="100" w:line="276"/>
+      </w:pPr>
+      <w:r>
+        <w:rPr>
+          <w:b/>
+          <w:bCs/>
+          <w:color w:val="1F3864"/>
+          <w:sz w:val="22"/>
+          <w:szCs w:val="22"/>
+        </w:rPr>
+        <w:t xml:space="preserve">Kho &amp; Sản xuất ▸ Tồn kho &amp; nhập ▸ thẻ Tồn kho</w:t>
+      </w:r>
+      <w:r>
+        <w:rPr>
+          <w:sz w:val="22"/>
+          <w:szCs w:val="22"/>
+        </w:rPr>
+        <w:t xml:space="preserve"> → ở mỗi dòng lô, bấm nút </w:t>
+      </w:r>
+      <w:r>
+        <w:rPr>
+          <w:b/>
+          <w:bCs/>
+          <w:sz w:val="22"/>
+          <w:szCs w:val="22"/>
+        </w:rPr>
+        <w:t xml:space="preserve">Kiểm kê / Điều chỉnh</w:t>
+      </w:r>
+      <w:r>
+        <w:rPr>
+          <w:sz w:val="22"/>
+          <w:szCs w:val="22"/>
+        </w:rPr>
+        <w:t xml:space="preserve"> (biểu tượng ✔). Hộp thoại hiện ra:</w:t>
+      </w:r>
+    </w:p>
+    <w:p>
+      <w:pPr>
+        <w:pStyle w:val="ListParagraph"/>
+        <w:numPr>
+          <w:ilvl w:val="0"/>
+          <w:numId w:val="3"/>
+        </w:numPr>
+        <w:spacing w:after="60" w:line="276"/>
+      </w:pPr>
+      <w:r>
+        <w:rPr>
+          <w:sz w:val="22"/>
+          <w:szCs w:val="22"/>
+        </w:rPr>
+        <w:t xml:space="preserve">Xem </w:t>
+      </w:r>
+      <w:r>
+        <w:rPr>
+          <w:b/>
+          <w:bCs/>
+          <w:sz w:val="22"/>
+          <w:szCs w:val="22"/>
+        </w:rPr>
+        <w:t xml:space="preserve">tồn theo sổ</w:t>
+      </w:r>
+      <w:r>
+        <w:rPr>
+          <w:sz w:val="22"/>
+          <w:szCs w:val="22"/>
+        </w:rPr>
+        <w:t xml:space="preserve"> hiện tại của lô.</w:t>
+      </w:r>
+    </w:p>
+    <w:p>
+      <w:pPr>
+        <w:pStyle w:val="ListParagraph"/>
+        <w:numPr>
+          <w:ilvl w:val="0"/>
+          <w:numId w:val="3"/>
+        </w:numPr>
+        <w:spacing w:after="60" w:line="276"/>
+      </w:pPr>
+      <w:r>
+        <w:rPr>
+          <w:sz w:val="22"/>
+          <w:szCs w:val="22"/>
+        </w:rPr>
+        <w:t xml:space="preserve">Nhập </w:t>
+      </w:r>
+      <w:r>
+        <w:rPr>
+          <w:b/>
+          <w:bCs/>
+          <w:sz w:val="22"/>
+          <w:szCs w:val="22"/>
+        </w:rPr>
+        <w:t xml:space="preserve">số tồn thực tế đếm được</w:t>
+      </w:r>
+      <w:r>
+        <w:rPr>
+          <w:sz w:val="22"/>
+          <w:szCs w:val="22"/>
+        </w:rPr>
+        <w:t xml:space="preserve"> trong kho.</w:t>
+      </w:r>
+    </w:p>
+    <w:p>
+      <w:pPr>
+        <w:pStyle w:val="ListParagraph"/>
+        <w:numPr>
+          <w:ilvl w:val="0"/>
+          <w:numId w:val="3"/>
+        </w:numPr>
+        <w:spacing w:after="60" w:line="276"/>
+      </w:pPr>
+      <w:r>
+        <w:rPr>
+          <w:sz w:val="22"/>
+          <w:szCs w:val="22"/>
+        </w:rPr>
+        <w:t xml:space="preserve">Hệ thống tự tính </w:t>
+      </w:r>
+      <w:r>
+        <w:rPr>
+          <w:b/>
+          <w:bCs/>
+          <w:sz w:val="22"/>
+          <w:szCs w:val="22"/>
+        </w:rPr>
+        <w:t xml:space="preserve">chênh lệch</w:t>
+      </w:r>
+      <w:r>
+        <w:rPr>
+          <w:sz w:val="22"/>
+          <w:szCs w:val="22"/>
+        </w:rPr>
+        <w:t xml:space="preserve"> (đỏ = hao hụt/giảm, xanh = thừa/tăng); nhập </w:t>
+      </w:r>
+      <w:r>
+        <w:rPr>
+          <w:b/>
+          <w:bCs/>
+          <w:sz w:val="22"/>
+          <w:szCs w:val="22"/>
+        </w:rPr>
+        <w:t xml:space="preserve">Lý do</w:t>
+      </w:r>
+      <w:r>
+        <w:rPr>
+          <w:sz w:val="22"/>
+          <w:szCs w:val="22"/>
+        </w:rPr>
+        <w:t xml:space="preserve">.</w:t>
+      </w:r>
+    </w:p>
+    <w:p>
+      <w:pPr>
+        <w:pStyle w:val="ListParagraph"/>
+        <w:numPr>
+          <w:ilvl w:val="0"/>
+          <w:numId w:val="3"/>
+        </w:numPr>
+        <w:spacing w:after="60" w:line="276"/>
+      </w:pPr>
+      <w:r>
+        <w:rPr>
+          <w:sz w:val="22"/>
+          <w:szCs w:val="22"/>
+        </w:rPr>
+        <w:t xml:space="preserve">Bấm </w:t>
+      </w:r>
+      <w:r>
+        <w:rPr>
+          <w:b/>
+          <w:bCs/>
+          <w:sz w:val="22"/>
+          <w:szCs w:val="22"/>
+        </w:rPr>
+        <w:t xml:space="preserve">LƯU ĐIỀU CHỈNH</w:t>
+      </w:r>
+      <w:r>
+        <w:rPr>
+          <w:sz w:val="22"/>
+          <w:szCs w:val="22"/>
+        </w:rPr>
+        <w:t xml:space="preserve"> → ghi một dòng “Điều chỉnh (+/−)” vào sổ kho, giữ nguyên hạn dùng của lô; tồn về đúng số đếm.</w:t>
+      </w:r>
+    </w:p>
+    <w:p>
+      <w:pPr>
+        <w:pBdr>
+          <w:left w:val="single" w:color="2E5AAC" w:sz="18" w:space="12"/>
+        </w:pBdr>
+        <w:shd w:fill="EAF0FB" w:color="auto" w:val="clear"/>
+        <w:spacing w:after="120" w:before="80"/>
+      </w:pPr>
+      <w:r>
+        <w:rPr>
+          <w:b/>
+          <w:bCs/>
+          <w:color w:val="2E5AAC"/>
+          <w:sz w:val="22"/>
+          <w:szCs w:val="22"/>
+        </w:rPr>
+        <w:t xml:space="preserve">Ví dụ: </w:t>
+      </w:r>
+      <w:r>
+        <w:rPr>
+          <w:sz w:val="22"/>
+          <w:szCs w:val="22"/>
+        </w:rPr>
+        <w:t xml:space="preserve">Lô bột L-BOT-01 tồn sổ 2 kg, đếm thực tế chỉ còn 1.5 kg → nhập 1.5, hệ thống ghi điều chỉnh −0.5 kg (lý do “hao hụt”); tồn về 1.5 kg.</w:t>
+      </w:r>
+    </w:p>
+    <w:p>
+      <w:pPr>
+        <w:pStyle w:val="Heading1"/>
+        <w:spacing w:after="120" w:before="260"/>
+      </w:pPr>
+      <w:r>
+        <w:rPr>
+          <w:b/>
+          <w:bCs/>
+          <w:color w:val="1F3864"/>
+          <w:sz w:val="30"/>
+          <w:szCs w:val="30"/>
+        </w:rPr>
+        <w:t xml:space="preserve">10. Kết quả kiểm chứng của luồng mẫu</w:t>
       </w:r>
     </w:p>
     <w:p>

</xml_diff>